<commit_message>
Render citations and bibliographies with biblatex via a make4ht oracle
Citations are copied in document order (with footnote context) into a small
document using the same biblatex setup, rendered by tex4ht and mapped back,
so \cite/\footcite/\printbibliography match the PDF exactly. Markers now use
\href so they stay inline at paragraph starts; verification ignores running
heads glued to body lines and includes OMML text.

Co-Authored-By: Claude Opus 5.5 <noreply@anthropic.com>
</commit_message>
<xml_diff>
--- a/src/tex2docx/data/reference.docx
+++ b/src/tex2docx/data/reference.docx
@@ -658,7 +658,10 @@
     <w:basedOn w:val="Normal"/>
     <w:next w:val="Bibliography"/>
     <w:qFormat/>
-    <w:pPr/>
+    <w:pPr>
+      <w:spacing w:before="0" w:after="120"/>
+      <w:ind w:left="720" w:hanging="720"/>
+    </w:pPr>
     <w:rPr/>
   </w:style>
   <w:style w:type="paragraph" w:styleId="Heading1">

</xml_diff>